<commit_message>
Nueva tarea Historia Sagrada y Tutoria
</commit_message>
<xml_diff>
--- a/Melany - IAFO/Historia Sagrada y Tutoria/Melany clases H sagrada y Tutoria - proxima semana.docx
+++ b/Melany - IAFO/Historia Sagrada y Tutoria/Melany clases H sagrada y Tutoria - proxima semana.docx
@@ -4,6 +4,7 @@
   <w:body>
     <w:p>
       <w:pPr>
+        <w:ind w:left="708" w:hanging="708"/>
         <w:jc w:val="center"/>
         <w:rPr>
           <w:b/>
@@ -209,7 +210,15 @@
         </w:numPr>
       </w:pPr>
       <w:r>
-        <w:t>Cuál es el significado del termino griego “</w:t>
+        <w:t xml:space="preserve">Cuál es el significado del </w:t>
+      </w:r>
+      <w:proofErr w:type="spellStart"/>
+      <w:r>
+        <w:t>termino</w:t>
+      </w:r>
+      <w:proofErr w:type="spellEnd"/>
+      <w:r>
+        <w:t xml:space="preserve"> griego “</w:t>
       </w:r>
       <w:proofErr w:type="spellStart"/>
       <w:r>
@@ -375,7 +384,7 @@
           <w:bCs/>
           <w:color w:val="EE0000"/>
         </w:rPr>
-        <w:t>EN GRUPOS D E DOS PERSONAS:</w:t>
+        <w:t>EN GRUPOS DE DOS PERSONAS:</w:t>
       </w:r>
     </w:p>
     <w:p>
@@ -2774,6 +2783,7 @@
   <w:style w:type="character" w:default="1" w:styleId="Fuentedeprrafopredeter">
     <w:name w:val="Default Paragraph Font"/>
     <w:uiPriority w:val="1"/>
+    <w:semiHidden/>
     <w:unhideWhenUsed/>
   </w:style>
   <w:style w:type="table" w:default="1" w:styleId="Tablanormal">

</xml_diff>